<commit_message>
Remove bracketed placeholders from the ESWA manuscript, highlights and cover letter
Co-Authored-By: Claude Sonnet 5.5 <noreply@anthropic.com>
Claude-Session: https://claude.ai/code/session_014FRGRi7axQM37FZZhPBo12
</commit_message>
<xml_diff>
--- a/ESWA_Cover_Letter.docx
+++ b/ESWA_Cover_Letter.docx
@@ -2,21 +2,6 @@
 <file path=word/document.xml><?xml version="1.0" encoding="utf-8"?>
 <w:document xmlns:wpc="http://schemas.microsoft.com/office/word/2010/wordprocessingCanvas" xmlns:mo="http://schemas.microsoft.com/office/mac/office/2008/main" xmlns:mc="http://schemas.openxmlformats.org/markup-compatibility/2006" xmlns:mv="urn:schemas-microsoft-com:mac:vml" xmlns:o="urn:schemas-microsoft-com:office:office" xmlns:r="http://schemas.openxmlformats.org/officeDocument/2006/relationships" xmlns:m="http://schemas.openxmlformats.org/officeDocument/2006/math" xmlns:v="urn:schemas-microsoft-com:vml" xmlns:wp14="http://schemas.microsoft.com/office/word/2010/wordprocessingDrawing" xmlns:wp="http://schemas.openxmlformats.org/drawingml/2006/wordprocessingDrawing" xmlns:w10="urn:schemas-microsoft-com:office:word" xmlns:w="http://schemas.openxmlformats.org/wordprocessingml/2006/main" xmlns:w14="http://schemas.microsoft.com/office/word/2010/wordml" xmlns:wpg="http://schemas.microsoft.com/office/word/2010/wordprocessingGroup" xmlns:wpi="http://schemas.microsoft.com/office/word/2010/wordprocessingInk" xmlns:wne="http://schemas.microsoft.com/office/word/2006/wordml" xmlns:wps="http://schemas.microsoft.com/office/word/2010/wordprocessingShape" mc:Ignorable="w14 wp14">
   <w:body>
-    <w:p>
-      <w:pPr>
-        <w:keepNext w:val="0"/>
-        <w:spacing w:after="120" w:line="312" w:lineRule="auto"/>
-        <w:jc w:val="left"/>
-      </w:pPr>
-      <w:r>
-        <w:rPr>
-          <w:rFonts w:ascii="Times New Roman" w:hAnsi="Times New Roman" w:eastAsia="Times New Roman"/>
-          <w:b w:val="0"/>
-          <w:i w:val="0"/>
-        </w:rPr>
-        <w:t>[Date]</w:t>
-      </w:r>
-    </w:p>
     <w:p>
       <w:pPr>
         <w:keepNext w:val="0"/>
@@ -119,22 +104,7 @@
           <w:b w:val="0"/>
           <w:i w:val="0"/>
         </w:rPr>
-        <w:t>The manuscript is original, has not been published previously, and is not under consideration elsewhere. A declaration on the use of generative AI is included in the manuscript, in line with the journal's policy. [Authors: confirm that all authors have approved the submission, and complete the declarations of interest and funding.]</w:t>
-      </w:r>
-    </w:p>
-    <w:p>
-      <w:pPr>
-        <w:keepNext w:val="0"/>
-        <w:spacing w:after="120" w:line="312" w:lineRule="auto"/>
-        <w:jc w:val="both"/>
-      </w:pPr>
-      <w:r>
-        <w:rPr>
-          <w:rFonts w:ascii="Times New Roman" w:hAnsi="Times New Roman" w:eastAsia="Times New Roman"/>
-          <w:b w:val="0"/>
-          <w:i w:val="0"/>
-        </w:rPr>
-        <w:t>Suggested reviewers: [name, affiliation, e-mail] (three to five, none from the authors' institutions).</w:t>
+        <w:t>The manuscript is original, has not been published previously, and is not under consideration elsewhere. A declaration on the use of generative AI is included in the manuscript, in line with the journal's policy.</w:t>
       </w:r>
     </w:p>
     <w:p>
@@ -179,7 +149,7 @@
           <w:b w:val="0"/>
           <w:i w:val="0"/>
         </w:rPr>
-        <w:t>[Corresponding author name, affiliation, e-mail]</w:t>
+        <w:t>The authors</w:t>
       </w:r>
     </w:p>
     <w:sectPr>

</xml_diff>

<commit_message>
Add author name, affiliation and corresponding-author e-mail to the ESWA manuscript and cover letter
Co-Authored-By: Claude Sonnet 5.5 <noreply@anthropic.com>
Claude-Session: https://claude.ai/code/session_014FRGRi7axQM37FZZhPBo12
</commit_message>
<xml_diff>
--- a/ESWA_Cover_Letter.docx
+++ b/ESWA_Cover_Letter.docx
@@ -140,6 +140,36 @@
     <w:p>
       <w:pPr>
         <w:keepNext w:val="0"/>
+        <w:spacing w:after="0" w:line="312" w:lineRule="auto"/>
+        <w:jc w:val="left"/>
+      </w:pPr>
+      <w:r>
+        <w:rPr>
+          <w:rFonts w:ascii="Times New Roman" w:hAnsi="Times New Roman" w:eastAsia="Times New Roman"/>
+          <w:b w:val="0"/>
+          <w:i w:val="0"/>
+        </w:rPr>
+        <w:t>Ook Lee</w:t>
+      </w:r>
+    </w:p>
+    <w:p>
+      <w:pPr>
+        <w:keepNext w:val="0"/>
+        <w:spacing w:after="0" w:line="312" w:lineRule="auto"/>
+        <w:jc w:val="left"/>
+      </w:pPr>
+      <w:r>
+        <w:rPr>
+          <w:rFonts w:ascii="Times New Roman" w:hAnsi="Times New Roman" w:eastAsia="Times New Roman"/>
+          <w:b w:val="0"/>
+          <w:i w:val="0"/>
+        </w:rPr>
+        <w:t>Department of Information System, Hanyang University, Seoul, Korea</w:t>
+      </w:r>
+    </w:p>
+    <w:p>
+      <w:pPr>
+        <w:keepNext w:val="0"/>
         <w:spacing w:after="120" w:line="312" w:lineRule="auto"/>
         <w:jc w:val="left"/>
       </w:pPr>
@@ -149,7 +179,7 @@
           <w:b w:val="0"/>
           <w:i w:val="0"/>
         </w:rPr>
-        <w:t>The authors</w:t>
+        <w:t>E-mail: ooklee@hanyang.ac.kr</w:t>
       </w:r>
     </w:p>
     <w:sectPr>

</xml_diff>